<commit_message>
Update portfolio and resume with SaaS and RAG demos
</commit_message>
<xml_diff>
--- a/downloads/Leonid_Chekin_Resume_Python_AI_FinTech.docx
+++ b/downloads/Leonid_Chekin_Resume_Python_AI_FinTech.docx
@@ -59,7 +59,7 @@
         <w:spacing w:after="40"/>
       </w:pPr>
       <w:r>
-        <w:t>Python, FastAPI, REST API, PostgreSQL, SQLite, InfluxDB, Docker, Git и Linux.</w:t>
+        <w:t>Python, FastAPI, SQLAlchemy, Alembic, REST API, PostgreSQL, SQLite, InfluxDB, Redis, Celery, JWT/RBAC, Docker, Git и Linux.</w:t>
       </w:r>
     </w:p>
     <w:p>
@@ -77,7 +77,7 @@
         <w:spacing w:after="40"/>
       </w:pPr>
       <w:r>
-        <w:t>LLM-интеграции, Ollama, embeddings, pgvector, обработка и маршрутизация данных.</w:t>
+        <w:t>LLM-интеграции и RAG: Ollama, embeddings, Qdrant, pgvector, обработка и маршрутизация данных.</w:t>
       </w:r>
     </w:p>
     <w:p>
@@ -95,7 +95,7 @@
         <w:spacing w:after="40"/>
       </w:pPr>
       <w:r>
-        <w:t>Работа с CSV, Excel, JSON, Pandas и структурированием данных.</w:t>
+        <w:t>Работа с CSV, Excel, JSON, Pandas и структурированием данных; Pytest, GitHub Actions, GitLab CI/CD и Prometheus.</w:t>
       </w:r>
     </w:p>
     <w:p>
@@ -151,6 +151,34 @@
       </w:pPr>
       <w:r>
         <w:t>Избранные проекты</w:t>
+      </w:r>
+    </w:p>
+    <w:p>
+      <w:pPr>
+        <w:pStyle w:val="Heading2"/>
+      </w:pPr>
+      <w:r>
+        <w:t>Pulseboard — SaaS Backend</w:t>
+      </w:r>
+    </w:p>
+    <w:p>
+      <w:pPr/>
+      <w:r>
+        <w:t>Публичный demo-проект: multi-tenant FastAPI, SQLAlchemy, PostgreSQL/Alembic, JWT/RBAC, tenant isolation, webhook idempotency, Celery/Redis, WebSockets, Prometheus/Grafana, Docker Compose, GitHub Actions, pytest и OpenAPI. Облачное демо использует SQLite и может сбрасывать данные; полный стек запускается локально через Docker Compose. Код: github.com/leonidchekin55/developer-portfolio-python-ai. Демо: portfolio-pulseboard-demo.onrender.com/docs.</w:t>
+      </w:r>
+    </w:p>
+    <w:p>
+      <w:pPr>
+        <w:pStyle w:val="Heading2"/>
+      </w:pPr>
+      <w:r>
+        <w:t>Knowledge Assistant — RAG</w:t>
+      </w:r>
+    </w:p>
+    <w:p>
+      <w:pPr/>
+      <w:r>
+        <w:t>Публичный demo-проект: загрузка PDF/DOCX/TXT, chunking с метаданными страниц, retrieval, ответы с источниками и история диалогов. Локальный профиль использует Qdrant и Ollama для embeddings/генерации; облачный профиль работает без платного API-ключа через extractive retrieval. React/Tailwind, FastAPI, Docker Compose и тесты. Код: github.com/leonidchekin55/developer-portfolio-python-ai. Демо: portfolio-knowledge-demo.onrender.com.</w:t>
       </w:r>
     </w:p>
     <w:p>

</xml_diff>

<commit_message>
feat: make portfolio demos tangible
</commit_message>
<xml_diff>
--- a/downloads/Leonid_Chekin_Resume_Python_AI_FinTech.docx
+++ b/downloads/Leonid_Chekin_Resume_Python_AI_FinTech.docx
@@ -16,12 +16,7 @@
         <w:spacing w:after="80"/>
       </w:pPr>
       <w:r>
-        <w:rPr>
-          <w:b/>
-          <w:color w:val="172A24"/>
-          <w:sz w:val="30"/>
-        </w:rPr>
-        <w:t>Python / AI / FinTech Developer</w:t>
+        <w:t>Python Backend Developer | Applied AI | FinTech</w:t>
       </w:r>
     </w:p>
     <w:p>
@@ -29,7 +24,7 @@
         <w:spacing w:after="240"/>
       </w:pPr>
       <w:r>
-        <w:t>Telegram: @leonchek97  |  GitHub: github.com/leonidchekin55  |  Портфолио: leonid-portfolio.onrender.com</w:t>
+        <w:t>Telegram: @leonchek97  |  GitHub: github.com/leonidchekin55  |  Портфолио: https://leonid-portfolio.onrender.com</w:t>
       </w:r>
     </w:p>
     <w:p>
@@ -42,7 +37,7 @@
     </w:p>
     <w:p>
       <w:r>
-        <w:t>Python-разработчик с фокусом на backend, API, интеграции и автоматизацию. Соединяю инженерный опыт с практикой работы с рыночными данными и почти 3,5 годами опыта в quantitative / algorithmic trading. Интересуют задачи на пересечении Python, AI, данных и FinTech.</w:t>
+        <w:t>Python-разработчик с коммерческим опытом с 2022 года. Специализируюсь на backend, REST API, интеграциях и автоматизации. Также имею около 3,5 лет опыта в quantitative / algorithmic trading: работал с рыночными данными и временными рядами. Интересуют задачи на пересечении Python, AI, данных и FinTech.</w:t>
       </w:r>
     </w:p>
     <w:p>
@@ -59,7 +54,7 @@
         <w:spacing w:after="40"/>
       </w:pPr>
       <w:r>
-        <w:t>Python, FastAPI, SQLAlchemy, Alembic, REST API, PostgreSQL, SQLite, InfluxDB, Redis, Celery, JWT/RBAC, Docker, Git и Linux.</w:t>
+        <w:t>Python, FastAPI, SQLAlchemy, Alembic, PostgreSQL, SQLite, Redis, Celery, InfluxDB, Docker, Linux, JWT и RBAC.</w:t>
       </w:r>
     </w:p>
     <w:p>
@@ -68,7 +63,7 @@
         <w:spacing w:after="40"/>
       </w:pPr>
       <w:r>
-        <w:t>Интеграция внешних API, webhooks, обработка ошибок, валидация, timeout и retry.</w:t>
+        <w:t>REST API и интеграции: webhooks, подписи и идемпотентность, обработка ошибок, валидация, timeout и retry.</w:t>
       </w:r>
     </w:p>
     <w:p>
@@ -77,7 +72,7 @@
         <w:spacing w:after="40"/>
       </w:pPr>
       <w:r>
-        <w:t>LLM-интеграции и RAG: Ollama, embeddings, Qdrant, pgvector, обработка и маршрутизация данных.</w:t>
+        <w:t>AI и поиск по документам: LLM, Ollama, embeddings, RAG, Qdrant, pgvector, извлечение текста из PDF/DOCX/TXT и ссылки на источники.</w:t>
       </w:r>
     </w:p>
     <w:p>
@@ -86,7 +81,7 @@
         <w:spacing w:after="40"/>
       </w:pPr>
       <w:r>
-        <w:t>Telegram Bot API и Mini Apps; React, Tailwind и Supabase на уровне продуктовых MVP.</w:t>
+        <w:t>Telegram Bot API и Mini Apps; React и Tailwind для интерфейсов продуктовых MVP; интеграции с amoCRM, n8n и внешними API.</w:t>
       </w:r>
     </w:p>
     <w:p>
@@ -95,7 +90,7 @@
         <w:spacing w:after="40"/>
       </w:pPr>
       <w:r>
-        <w:t>Работа с CSV, Excel, JSON, Pandas и структурированием данных; Pytest, GitHub Actions, GitLab CI/CD и Prometheus.</w:t>
+        <w:t>Качество и доставка: pytest, GitHub Actions, GitLab CI/CD, Prometheus, OpenAPI; работа с CSV, Excel, JSON и Pandas.</w:t>
       </w:r>
     </w:p>
     <w:p>
@@ -116,7 +111,7 @@
     </w:p>
     <w:p>
       <w:r>
-        <w:t>Разработка серверной логики, REST API и структуры данных. Работа с базами данных, внешними сервисами, фоновыми задачами, Docker-окружением и диагностикой сервисов.</w:t>
+        <w:t>Разрабатываю серверную логику, REST API и интеграции. Работаю с базами данных, очередями, фоновыми задачами и Docker-окружением; проверяю ошибки, права доступа и пограничные сценарии.</w:t>
       </w:r>
     </w:p>
     <w:p>
@@ -148,6 +143,7 @@
     <w:p>
       <w:pPr>
         <w:pStyle w:val="Heading1"/>
+        <w:pageBreakBefore/>
       </w:pPr>
       <w:r>
         <w:t>Избранные проекты</w:t>
@@ -158,13 +154,13 @@
         <w:pStyle w:val="Heading2"/>
       </w:pPr>
       <w:r>
-        <w:t>Pulseboard — SaaS Backend</w:t>
+        <w:t>Pulseboard — SaaS Backend и интерактивная песочница</w:t>
       </w:r>
     </w:p>
     <w:p>
       <w:pPr/>
       <w:r>
-        <w:t>Публичный demo-проект: multi-tenant FastAPI, SQLAlchemy, PostgreSQL/Alembic, JWT/RBAC, tenant isolation, webhook idempotency, Celery/Redis, WebSockets, Prometheus/Grafana, Docker Compose, GitHub Actions, pytest и OpenAPI. Облачное демо использует SQLite и может сбрасывать данные; полный стек запускается локально через Docker Compose. Код: github.com/leonidchekin55/developer-portfolio-python-ai. Демо: portfolio-pulseboard-demo.onrender.com/docs.</w:t>
+        <w:t>Публичный SaaS API: FastAPI, SQLAlchemy, PostgreSQL/Alembic, JWT/RBAC, tenant isolation, подписанные идемпотентные webhooks, Celery/Redis, WebSockets, Prometheus, Docker Compose, CI, pytest и OpenAPI. На сайте есть песочница: создание проектов и задач, смена статусов (данные остаются в браузере). API: https://portfolio-pulseboard-demo.onrender.com/docs. Код: https://github.com/leonidchekin55/developer-portfolio-python-ai.</w:t>
       </w:r>
     </w:p>
     <w:p>
@@ -172,13 +168,13 @@
         <w:pStyle w:val="Heading2"/>
       </w:pPr>
       <w:r>
-        <w:t>Knowledge Assistant — RAG</w:t>
+        <w:t>Knowledge Assistant — поиск по документам с AI</w:t>
       </w:r>
     </w:p>
     <w:p>
       <w:pPr/>
       <w:r>
-        <w:t>Публичный demo-проект: загрузка PDF/DOCX/TXT, chunking с метаданными страниц, retrieval, ответы с источниками и история диалогов. Локальный профиль использует Qdrant и Ollama для embeddings/генерации; облачный профиль работает без платного API-ключа через extractive retrieval. React/Tailwind, FastAPI, Docker Compose и тесты. Код: github.com/leonidchekin55/developer-portfolio-python-ai. Демо: portfolio-knowledge-demo.onrender.com.</w:t>
+        <w:t>Публичное демо принимает PDF, DOCX и TXT, разбивает текст на фрагменты с метаданными страниц, ищет релевантные места и показывает источники ответа. Есть история диалогов. Облачный режим работает без платного API-ключа; локальная сборка добавляет Qdrant и Ollama для embeddings и генерации. React, FastAPI, Docker Compose и тесты. Демо: https://portfolio-knowledge-demo.onrender.com. Код: https://github.com/leonidchekin55/developer-portfolio-python-ai.</w:t>
       </w:r>
     </w:p>
     <w:p>

</xml_diff>